<commit_message>
Add dashboard layout profiles
Users can save and switch between named tile layouts. The active profile
auto-saves on drag. First use migrates the existing layout to a Default
profile. Available to all roles via Settings → Profiles and the Profile
nav button. README and user manual updated.

Co-Authored-By: Claude Sonnet 4.6 <noreply@anthropic.com>
</commit_message>
<xml_diff>
--- a/docs/Ham-Shack-Navigator-User-Manual.docx
+++ b/docs/Ham-Shack-Navigator-User-Manual.docx
@@ -983,7 +983,7 @@
         <w:ind w:left="360"/>
       </w:pPr>
       <w:r>
-        <w:t>Navigation links: Dashboard, Workflows (admin), Settings, Events, Users (admin)</w:t>
+        <w:t>Profile button — switches the active dashboard layout profile (see Dashboard Profiles below)</w:t>
       </w:r>
     </w:p>
     <w:p>
@@ -992,7 +992,7 @@
         <w:ind w:left="360"/>
       </w:pPr>
       <w:r>
-        <w:t>Help button (opens this manual)</w:t>
+        <w:t>Navigation links: Dashboard, Workflows (admin), Settings, Events, Users (admin)</w:t>
       </w:r>
     </w:p>
     <w:p>
@@ -1001,7 +1001,7 @@
         <w:ind w:left="360"/>
       </w:pPr>
       <w:r>
-        <w:t>Logout button</w:t>
+        <w:t>Help button (opens this manual)</w:t>
       </w:r>
     </w:p>
     <w:p>
@@ -1010,7 +1010,89 @@
         <w:ind w:left="360"/>
       </w:pPr>
       <w:r>
+        <w:t>Logout button</w:t>
+      </w:r>
+    </w:p>
+    <w:p>
+      <w:pPr>
+        <w:pStyle w:val="ListBullet"/>
+        <w:ind w:left="360"/>
+      </w:pPr>
+      <w:r>
         <w:t>Role indicator badge (Admin or Read Only)</w:t>
+      </w:r>
+    </w:p>
+    <w:p>
+      <w:pPr>
+        <w:pStyle w:val="Heading2"/>
+      </w:pPr>
+      <w:r>
+        <w:t>Dashboard Profiles</w:t>
+      </w:r>
+    </w:p>
+    <w:p>
+      <w:r>
+        <w:t>Dashboard Profiles let each user save multiple named tile layouts and switch between them instantly. A weather-monitoring profile might keep the radar and lightning tile front and center; an operating profile might lead with the FlexRadio status and CW decoder.</w:t>
+      </w:r>
+    </w:p>
+    <w:p>
+      <w:pPr>
+        <w:pStyle w:val="ListBullet"/>
+        <w:ind w:left="360"/>
+      </w:pPr>
+      <w:r>
+        <w:t>Click the Profile button in the top nav to open the profile switcher — the active profile is highlighted. Click any profile name to switch to it immediately.</w:t>
+      </w:r>
+    </w:p>
+    <w:p>
+      <w:pPr>
+        <w:pStyle w:val="ListBullet"/>
+        <w:ind w:left="360"/>
+      </w:pPr>
+      <w:r>
+        <w:t>Manage profiles in Settings → Profiles: add, rename, delete, and update profiles. Clicking a profile name in the settings list also switches to it.</w:t>
+      </w:r>
+    </w:p>
+    <w:p>
+      <w:pPr>
+        <w:pStyle w:val="ListBullet"/>
+        <w:ind w:left="360"/>
+      </w:pPr>
+      <w:r>
+        <w:t>When a profile is active, dragging tiles auto-saves the new order to that profile.</w:t>
+      </w:r>
+    </w:p>
+    <w:p>
+      <w:pPr>
+        <w:pStyle w:val="ListBullet"/>
+        <w:ind w:left="360"/>
+      </w:pPr>
+      <w:r>
+        <w:t>Use the Update button to overwrite any profile with the current tile layout.</w:t>
+      </w:r>
+    </w:p>
+    <w:p>
+      <w:pPr>
+        <w:pStyle w:val="ListBullet"/>
+        <w:ind w:left="360"/>
+      </w:pPr>
+      <w:r>
+        <w:t>On first use, your existing layout is automatically saved as a Default profile.</w:t>
+      </w:r>
+    </w:p>
+    <w:p>
+      <w:pPr>
+        <w:ind w:left="360"/>
+      </w:pPr>
+      <w:r>
+        <w:rPr>
+          <w:b/>
+          <w:color w:val="4472C4"/>
+        </w:rPr>
+        <w:t xml:space="preserve">Note: </w:t>
+      </w:r>
+      <w:r>
+        <w:t>All users — including Read Only — can create and manage their own profiles.</w:t>
       </w:r>
     </w:p>
     <w:p>
@@ -1892,6 +1974,38 @@
           <w:p>
             <w:r>
               <w:t>Supports multi-location profiles</w:t>
+            </w:r>
+          </w:p>
+        </w:tc>
+      </w:tr>
+      <w:tr>
+        <w:tc>
+          <w:tcPr>
+            <w:tcW w:type="dxa" w:w="2880"/>
+          </w:tcPr>
+          <w:p>
+            <w:r>
+              <w:t>Profiles</w:t>
+            </w:r>
+          </w:p>
+        </w:tc>
+        <w:tc>
+          <w:tcPr>
+            <w:tcW w:type="dxa" w:w="2880"/>
+          </w:tcPr>
+          <w:p>
+            <w:r>
+              <w:t>Create, rename, update, delete dashboard layout profiles</w:t>
+            </w:r>
+          </w:p>
+        </w:tc>
+        <w:tc>
+          <w:tcPr>
+            <w:tcW w:type="dxa" w:w="2880"/>
+          </w:tcPr>
+          <w:p>
+            <w:r>
+              <w:t>Available to all users; switch via nav Profile button</w:t>
             </w:r>
           </w:p>
         </w:tc>

</xml_diff>

<commit_message>
Add ntfy push notifications and NWS severe weather alert notifications
- New ntfy notification channel: settings UI (server URL, topic, token),
  backend service, GET/PUT/test API endpoints, notification toggles
- NWS severe weather alert notifications: configurable level (None /
  Watch or Warning / Warning only) in Settings → Thresholds; sends
  through all configured channels on new alert events with fingerprint
  deduplication to avoid repeat notifications during active alerts
- Update README and user manual to document both features

Co-Authored-By: Claude Sonnet 4.6 <noreply@anthropic.com>
</commit_message>
<xml_diff>
--- a/docs/Ham-Shack-Navigator-User-Manual.docx
+++ b/docs/Ham-Shack-Navigator-User-Manual.docx
@@ -221,7 +221,7 @@
         <w:ind w:left="360"/>
       </w:pPr>
       <w:r>
-        <w:t>Notifications via email, Telegram, and IFTTT</w:t>
+        <w:t>Notifications via email, Telegram, IFTTT, and ntfy push notifications</w:t>
       </w:r>
     </w:p>
     <w:p>
@@ -370,6 +370,15 @@
       </w:pPr>
       <w:r>
         <w:t>IFTTT account with Webhooks service enabled</w:t>
+      </w:r>
+    </w:p>
+    <w:p>
+      <w:pPr>
+        <w:pStyle w:val="ListBullet"/>
+        <w:ind w:left="360"/>
+      </w:pPr>
+      <w:r>
+        <w:t>ntfy account or self-hosted ntfy server (free push notifications; iOS/Android app)</w:t>
       </w:r>
     </w:p>
     <w:p>
@@ -1713,50 +1722,65 @@
     </w:p>
     <w:p>
       <w:pPr>
-        <w:pStyle w:val="Heading2"/>
-      </w:pPr>
-      <w:r>
-        <w:t>Manual Shutdown</w:t>
-      </w:r>
-    </w:p>
-    <w:p>
-      <w:r>
-        <w:t>Click Run Shutdown on the dashboard to trigger the Shutdown workflow immediately, regardless of weather conditions or monitoring state.</w:t>
-      </w:r>
-    </w:p>
-    <w:p>
-      <w:pPr>
-        <w:pStyle w:val="Heading1"/>
-      </w:pPr>
-      <w:r>
-        <w:t>9. Notifications</w:t>
-      </w:r>
-    </w:p>
-    <w:p>
-      <w:r>
-        <w:t>Ham Shack Navigator can notify you through three channels, each independently enabled/disabled via Settings → Notification Toggles.</w:t>
-      </w:r>
-    </w:p>
-    <w:p>
-      <w:pPr>
-        <w:pStyle w:val="Heading2"/>
-      </w:pPr>
-      <w:r>
-        <w:t>Email (SMTP)</w:t>
-      </w:r>
-    </w:p>
-    <w:p>
-      <w:r>
-        <w:t>Configure in Settings → SMTP / Email: host, port (default 587), username, password, from/to addresses. Use the Test button to verify. Gmail users: use an App Password and smtp.gmail.com on port 587.</w:t>
-      </w:r>
-    </w:p>
-    <w:p>
-      <w:pPr>
         <w:pStyle w:val="ListBullet"/>
         <w:ind w:left="360"/>
       </w:pPr>
       <w:r>
-        <w:t>Shutdown email — sent when the Shutdown workflow is triggered automatically</w:t>
+        <w:t>NWS Severe Weather Alert Notifications — choose None (no notifications), Watch or Warning (notify for any Watch or Warning issued for your location), or Warning only (notify only for the more urgent Warning level). Notifications are sent through all configured channels (email, Telegram, IFTTT, ntfy) and only fire when the active alert set changes, preventing repeated notifications during a long-running event.</w:t>
+      </w:r>
+    </w:p>
+    <w:p>
+      <w:pPr>
+        <w:ind w:left="360"/>
+      </w:pPr>
+      <w:r>
+        <w:rPr>
+          <w:b/>
+          <w:color w:val="4472C4"/>
+        </w:rPr>
+        <w:t xml:space="preserve">Note: </w:t>
+      </w:r>
+      <w:r>
+        <w:t>NWS alerts are only available for US locations. This setting has no effect outside NWS coverage.</w:t>
+      </w:r>
+    </w:p>
+    <w:p>
+      <w:pPr>
+        <w:pStyle w:val="Heading2"/>
+      </w:pPr>
+      <w:r>
+        <w:t>Manual Shutdown</w:t>
+      </w:r>
+    </w:p>
+    <w:p>
+      <w:r>
+        <w:t>Click Run Shutdown on the dashboard to trigger the Shutdown workflow immediately, regardless of weather conditions or monitoring state.</w:t>
+      </w:r>
+    </w:p>
+    <w:p>
+      <w:pPr>
+        <w:pStyle w:val="Heading1"/>
+      </w:pPr>
+      <w:r>
+        <w:t>9. Notifications</w:t>
+      </w:r>
+    </w:p>
+    <w:p>
+      <w:r>
+        <w:t>Ham Shack Navigator can notify you through four channels, each independently enabled/disabled via Settings → Notification Toggles.</w:t>
+      </w:r>
+    </w:p>
+    <w:p>
+      <w:pPr>
+        <w:pStyle w:val="Heading2"/>
+      </w:pPr>
+      <w:r>
+        <w:t>Email (SMTP)</w:t>
+      </w:r>
+    </w:p>
+    <w:p>
+      <w:r>
+        <w:t>Configure in Settings → SMTP / Email: host, port (default 587), username, password, from/to addresses. Use the Test button to verify. Gmail users: use an App Password and smtp.gmail.com on port 587.</w:t>
       </w:r>
     </w:p>
     <w:p>
@@ -1765,6 +1789,15 @@
         <w:ind w:left="360"/>
       </w:pPr>
       <w:r>
+        <w:t>Shutdown email — sent when the Shutdown workflow is triggered automatically</w:t>
+      </w:r>
+    </w:p>
+    <w:p>
+      <w:pPr>
+        <w:pStyle w:val="ListBullet"/>
+        <w:ind w:left="360"/>
+      </w:pPr>
+      <w:r>
         <w:t>Daily digest — optional daily status summary sent at a configured UTC time</w:t>
       </w:r>
     </w:p>
@@ -1821,12 +1854,66 @@
         <w:pStyle w:val="Heading2"/>
       </w:pPr>
       <w:r>
+        <w:t>ntfy</w:t>
+      </w:r>
+    </w:p>
+    <w:p>
+      <w:r>
+        <w:t>ntfy is a free, open-source push notification service with iOS and Android apps. No account is required for public topics on ntfy.sh.</w:t>
+      </w:r>
+    </w:p>
+    <w:p>
+      <w:pPr>
+        <w:pStyle w:val="ListNumber"/>
+        <w:ind w:left="360"/>
+      </w:pPr>
+      <w:r>
+        <w:t>Install the ntfy app from ntfy.sh on your phone.</w:t>
+      </w:r>
+    </w:p>
+    <w:p>
+      <w:pPr>
+        <w:pStyle w:val="ListNumber"/>
+        <w:ind w:left="360"/>
+      </w:pPr>
+      <w:r>
+        <w:t>Choose a unique, hard-to-guess topic name (e.g. my-ham-shack-4729). Anyone who knows the topic can subscribe.</w:t>
+      </w:r>
+    </w:p>
+    <w:p>
+      <w:pPr>
+        <w:pStyle w:val="ListNumber"/>
+        <w:ind w:left="360"/>
+      </w:pPr>
+      <w:r>
+        <w:t>Subscribe to your topic in the ntfy app.</w:t>
+      </w:r>
+    </w:p>
+    <w:p>
+      <w:pPr>
+        <w:pStyle w:val="ListNumber"/>
+        <w:ind w:left="360"/>
+      </w:pPr>
+      <w:r>
+        <w:t>Enter the topic in Settings → ntfy, enable the integration, and click Test.</w:t>
+      </w:r>
+    </w:p>
+    <w:p>
+      <w:r>
+        <w:t>Leave the Server URL as https://ntfy.sh unless you self-host ntfy. The optional Token field is only needed for access-controlled topics on a self-hosted server.</w:t>
+      </w:r>
+    </w:p>
+    <w:p>
+      <w:pPr>
+        <w:pStyle w:val="Heading2"/>
+      </w:pPr>
+      <w:r>
         <w:t>Notification Toggles</w:t>
       </w:r>
     </w:p>
     <w:p>
       <w:r>
-        <w:t>Settings → Notification Toggles allows independent enable/disable for: shutdown email, daily digest email, shutdown Telegram, threshold alert Telegram, shutdown IFTTT, threshold alert IFTTT.</w:t>
+        <w:t>Settings → Notification Toggles allows independent enable/disable for: shutdown email, daily digest email, shutdown Telegram, threshold alert Telegram, shutdown IFTTT, threshold alert IFTTT, shutdown ntfy, threshold alert ntfy.</w:t>
       </w:r>
     </w:p>
     <w:p>
@@ -2059,7 +2146,7 @@
           </w:tcPr>
           <w:p>
             <w:r>
-              <w:t>Wind, lightning distance, poll interval, cooldown</w:t>
+              <w:t>Wind, lightning distance, poll interval, cooldown, NWS alert level</w:t>
             </w:r>
           </w:p>
         </w:tc>
@@ -2069,7 +2156,7 @@
           </w:tcPr>
           <w:p>
             <w:r>
-              <w:t>Drives automatic shutdown</w:t>
+              <w:t>Drives automatic shutdown; NWS alert notifications sent on new alerts</w:t>
             </w:r>
           </w:p>
         </w:tc>
@@ -2433,6 +2520,38 @@
           </w:tcPr>
           <w:p>
             <w:r>
+              <w:t>ntfy</w:t>
+            </w:r>
+          </w:p>
+        </w:tc>
+        <w:tc>
+          <w:tcPr>
+            <w:tcW w:type="dxa" w:w="2880"/>
+          </w:tcPr>
+          <w:p>
+            <w:r>
+              <w:t>Server URL, topic, optional token</w:t>
+            </w:r>
+          </w:p>
+        </w:tc>
+        <w:tc>
+          <w:tcPr>
+            <w:tcW w:type="dxa" w:w="2880"/>
+          </w:tcPr>
+          <w:p>
+            <w:r>
+              <w:t>Free push notifications; ntfy.sh or self-hosted</w:t>
+            </w:r>
+          </w:p>
+        </w:tc>
+      </w:tr>
+      <w:tr>
+        <w:tc>
+          <w:tcPr>
+            <w:tcW w:type="dxa" w:w="2880"/>
+          </w:tcPr>
+          <w:p>
+            <w:r>
               <w:t>Notification Toggles</w:t>
             </w:r>
           </w:p>
@@ -2453,7 +2572,7 @@
           </w:tcPr>
           <w:p>
             <w:r>
-              <w:t>Visible to read-only users</w:t>
+              <w:t>Visible to read-only users; covers email, Telegram, IFTTT, ntfy</w:t>
             </w:r>
           </w:p>
         </w:tc>

</xml_diff>